<commit_message>
Add hyperparameter tuned notebook and updated reports
</commit_message>
<xml_diff>
--- a/Final_Outcomes_Report.docx
+++ b/Final_Outcomes_Report.docx
@@ -2,22 +2,22 @@
 <file path=word/document.xml><?xml version="1.0" encoding="utf-8"?>
 <w:document xmlns:w="http://schemas.openxmlformats.org/wordprocessingml/2006/main" xmlns:m="http://schemas.openxmlformats.org/officeDocument/2006/math" xmlns:r="http://schemas.openxmlformats.org/officeDocument/2006/relationships" xmlns:o="urn:schemas-microsoft-com:office:office" xmlns:v="urn:schemas-microsoft-com:vml" xmlns:w10="urn:schemas-microsoft-com:office:word" xmlns:a="http://schemas.openxmlformats.org/drawingml/2006/main" xmlns:pic="http://schemas.openxmlformats.org/drawingml/2006/picture" xmlns:wp="http://schemas.openxmlformats.org/drawingml/2006/wordprocessingDrawing">
   <w:body>
-    <w:bookmarkStart w:id="12" w:name="Xaf3014de7277407a1d68ed62babc13ed10b872f"/>
+    <w:bookmarkStart w:id="12" w:name="X873330e7c49b9a4fc2276f9e2ced6e24e3545a7"/>
     <w:p>
       <w:pPr>
         <w:pStyle w:val="Heading1"/>
       </w:pPr>
       <w:r>
-        <w:t xml:space="preserve">ICU Patient Deterioration Prediction - Baseline Models Final Report</w:t>
+        <w:t xml:space="preserve">ICU Patient Deterioration Prediction - Tuned Baseline Models Final Report</w:t>
       </w:r>
     </w:p>
-    <w:bookmarkStart w:id="9" w:name="logistic-regression-performance"/>
+    <w:bookmarkStart w:id="9" w:name="tuned-logistic-regression-performance"/>
     <w:p>
       <w:pPr>
         <w:pStyle w:val="Heading2"/>
       </w:pPr>
       <w:r>
-        <w:t xml:space="preserve">Logistic Regression Performance</w:t>
+        <w:t xml:space="preserve">Tuned Logistic Regression Performance</w:t>
       </w:r>
     </w:p>
     <w:p>
@@ -36,7 +36,7 @@
         <w:t xml:space="preserve">ROC-AUC Score</w:t>
       </w:r>
       <w:r>
-        <w:t xml:space="preserve">: 0.6346</w:t>
+        <w:t xml:space="preserve">: 0.6364</w:t>
       </w:r>
     </w:p>
     <w:p>
@@ -55,17 +55,17 @@
         <w:t xml:space="preserve">PR-AUC (Average Precision)</w:t>
       </w:r>
       <w:r>
-        <w:t xml:space="preserve">: 0.0718</w:t>
+        <w:t xml:space="preserve">: 0.0726</w:t>
       </w:r>
     </w:p>
     <w:bookmarkEnd w:id="9"/>
-    <w:bookmarkStart w:id="10" w:name="xgboost-performance"/>
+    <w:bookmarkStart w:id="10" w:name="tuned-xgboost-performance"/>
     <w:p>
       <w:pPr>
         <w:pStyle w:val="Heading2"/>
       </w:pPr>
       <w:r>
-        <w:t xml:space="preserve">XGBoost Performance</w:t>
+        <w:t xml:space="preserve">Tuned XGBoost Performance</w:t>
       </w:r>
     </w:p>
     <w:p>
@@ -84,7 +84,7 @@
         <w:t xml:space="preserve">ROC-AUC Score</w:t>
       </w:r>
       <w:r>
-        <w:t xml:space="preserve">: 0.6234</w:t>
+        <w:t xml:space="preserve">: 0.6276</w:t>
       </w:r>
     </w:p>
     <w:p>
@@ -103,17 +103,17 @@
         <w:t xml:space="preserve">PR-AUC (Average Precision)</w:t>
       </w:r>
       <w:r>
-        <w:t xml:space="preserve">: 0.0788</w:t>
+        <w:t xml:space="preserve">: 0.0872</w:t>
       </w:r>
     </w:p>
     <w:bookmarkEnd w:id="10"/>
-    <w:bookmarkStart w:id="11" w:name="X3fecff4c7706a373b479a4a22ab548083a11fd5"/>
+    <w:bookmarkStart w:id="11" w:name="X13b3f2375238b0b03dcd291b0981de7ef4d6ca1"/>
     <w:p>
       <w:pPr>
         <w:pStyle w:val="Heading2"/>
       </w:pPr>
       <w:r>
-        <w:t xml:space="preserve">Patient Risk Stratification (Using XGBoost)</w:t>
+        <w:t xml:space="preserve">Patient Risk Stratification (Using Tuned XGBoost)</w:t>
       </w:r>
     </w:p>
     <w:p>
@@ -121,7 +121,7 @@
         <w:pStyle w:val="FirstParagraph"/>
       </w:pPr>
       <w:r>
-        <w:t xml:space="preserve">The model’s predictions on the validation set (15,389 patients) were grouped into the following risk levels:</w:t>
+        <w:t xml:space="preserve">The tuned model’s predictions on the validation set (15,389 patients) were grouped into the following risk levels:</w:t>
       </w:r>
     </w:p>
     <w:tbl>
@@ -188,7 +188,7 @@
               <w:jc w:val="left"/>
             </w:pPr>
             <w:r>
-              <w:t xml:space="preserve">14,157</w:t>
+              <w:t xml:space="preserve">14,744</w:t>
             </w:r>
           </w:p>
         </w:tc>
@@ -218,7 +218,7 @@
               <w:jc w:val="left"/>
             </w:pPr>
             <w:r>
-              <w:t xml:space="preserve">852</w:t>
+              <w:t xml:space="preserve">422</w:t>
             </w:r>
           </w:p>
         </w:tc>
@@ -248,7 +248,7 @@
               <w:jc w:val="left"/>
             </w:pPr>
             <w:r>
-              <w:t xml:space="preserve">341</w:t>
+              <w:t xml:space="preserve">193</w:t>
             </w:r>
           </w:p>
         </w:tc>
@@ -278,7 +278,7 @@
               <w:jc w:val="left"/>
             </w:pPr>
             <w:r>
-              <w:t xml:space="preserve">39</w:t>
+              <w:t xml:space="preserve">30</w:t>
             </w:r>
           </w:p>
         </w:tc>

</xml_diff>